<commit_message>
vault backup: 2026-02-25 16:00:37
</commit_message>
<xml_diff>
--- a/Materias/Diseño de sistemas/Material/TP1/Flujos de sucesos/CU4 - Iniciar proceso de facturación/CU - Iniciar proceso de facturación.docx
+++ b/Materias/Diseño de sistemas/Material/TP1/Flujos de sucesos/CU4 - Iniciar proceso de facturación/CU - Iniciar proceso de facturación.docx
@@ -3094,26 +3094,12 @@
                 <w:insideV w:val="single" w:sz="18" w:space="0" w:color="FF0000"/>
               </w:tblBorders>
               <w:tblLayout w:type="fixed"/>
-              <w:tblCellMar>
-                <w:top w:w="0" w:type="dxa"/>
-                <w:left w:w="0" w:type="dxa"/>
-                <w:bottom w:w="0" w:type="dxa"/>
-                <w:right w:w="0" w:type="dxa"/>
-              </w:tblCellMar>
               <w:tblLook w:val="0600" w:firstRow="0" w:lastRow="0" w:firstColumn="0" w:lastColumn="0" w:noHBand="1" w:noVBand="1"/>
             </w:tblPr>
             <w:tblGrid>
               <w:gridCol w:w="8170"/>
             </w:tblGrid>
             <w:tr>
-              <w:tblPrEx>
-                <w:tblCellMar>
-                  <w:top w:w="0" w:type="dxa"/>
-                  <w:left w:w="0" w:type="dxa"/>
-                  <w:bottom w:w="0" w:type="dxa"/>
-                  <w:right w:w="0" w:type="dxa"/>
-                </w:tblCellMar>
-              </w:tblPrEx>
               <w:tc>
                 <w:tcPr>
                   <w:tcW w:w="8170" w:type="dxa"/>
@@ -3531,26 +3517,12 @@
                           <w:insideV w:val="single" w:sz="18" w:space="0" w:color="FF780A"/>
                         </w:tblBorders>
                         <w:tblLayout w:type="fixed"/>
-                        <w:tblCellMar>
-                          <w:top w:w="0" w:type="dxa"/>
-                          <w:left w:w="0" w:type="dxa"/>
-                          <w:bottom w:w="0" w:type="dxa"/>
-                          <w:right w:w="0" w:type="dxa"/>
-                        </w:tblCellMar>
                         <w:tblLook w:val="0600" w:firstRow="0" w:lastRow="0" w:firstColumn="0" w:lastColumn="0" w:noHBand="1" w:noVBand="1"/>
                       </w:tblPr>
                       <w:tblGrid>
                         <w:gridCol w:w="7970"/>
                       </w:tblGrid>
                       <w:tr>
-                        <w:tblPrEx>
-                          <w:tblCellMar>
-                            <w:top w:w="0" w:type="dxa"/>
-                            <w:left w:w="0" w:type="dxa"/>
-                            <w:bottom w:w="0" w:type="dxa"/>
-                            <w:right w:w="0" w:type="dxa"/>
-                          </w:tblCellMar>
-                        </w:tblPrEx>
                         <w:tc>
                           <w:tcPr>
                             <w:tcW w:w="7970" w:type="dxa"/>
@@ -3682,26 +3654,12 @@
                                     <w:insideV w:val="single" w:sz="18" w:space="0" w:color="FFCC00"/>
                                   </w:tblBorders>
                                   <w:tblLayout w:type="fixed"/>
-                                  <w:tblCellMar>
-                                    <w:top w:w="0" w:type="dxa"/>
-                                    <w:left w:w="0" w:type="dxa"/>
-                                    <w:bottom w:w="0" w:type="dxa"/>
-                                    <w:right w:w="0" w:type="dxa"/>
-                                  </w:tblCellMar>
                                   <w:tblLook w:val="0600" w:firstRow="0" w:lastRow="0" w:firstColumn="0" w:lastColumn="0" w:noHBand="1" w:noVBand="1"/>
                                 </w:tblPr>
                                 <w:tblGrid>
                                   <w:gridCol w:w="7770"/>
                                 </w:tblGrid>
                                 <w:tr>
-                                  <w:tblPrEx>
-                                    <w:tblCellMar>
-                                      <w:top w:w="0" w:type="dxa"/>
-                                      <w:left w:w="0" w:type="dxa"/>
-                                      <w:bottom w:w="0" w:type="dxa"/>
-                                      <w:right w:w="0" w:type="dxa"/>
-                                    </w:tblCellMar>
-                                  </w:tblPrEx>
                                   <w:tc>
                                     <w:tcPr>
                                       <w:tcW w:w="7770" w:type="dxa"/>
@@ -3999,26 +3957,12 @@
                                               <w:insideV w:val="single" w:sz="18" w:space="0" w:color="13CF0C"/>
                                             </w:tblBorders>
                                             <w:tblLayout w:type="fixed"/>
-                                            <w:tblCellMar>
-                                              <w:top w:w="0" w:type="dxa"/>
-                                              <w:left w:w="0" w:type="dxa"/>
-                                              <w:bottom w:w="0" w:type="dxa"/>
-                                              <w:right w:w="0" w:type="dxa"/>
-                                            </w:tblCellMar>
                                             <w:tblLook w:val="0600" w:firstRow="0" w:lastRow="0" w:firstColumn="0" w:lastColumn="0" w:noHBand="1" w:noVBand="1"/>
                                           </w:tblPr>
                                           <w:tblGrid>
                                             <w:gridCol w:w="7570"/>
                                           </w:tblGrid>
                                           <w:tr>
-                                            <w:tblPrEx>
-                                              <w:tblCellMar>
-                                                <w:top w:w="0" w:type="dxa"/>
-                                                <w:left w:w="0" w:type="dxa"/>
-                                                <w:bottom w:w="0" w:type="dxa"/>
-                                                <w:right w:w="0" w:type="dxa"/>
-                                              </w:tblCellMar>
-                                            </w:tblPrEx>
                                             <w:tc>
                                               <w:tcPr>
                                                 <w:tcW w:w="7570" w:type="dxa"/>
@@ -11313,9 +11257,7 @@
       <w:tblStyleRowBandSize w:val="1"/>
       <w:tblStyleColBandSize w:val="1"/>
       <w:tblCellMar>
-        <w:top w:w="0" w:type="dxa"/>
         <w:left w:w="108" w:type="dxa"/>
-        <w:bottom w:w="0" w:type="dxa"/>
         <w:right w:w="108" w:type="dxa"/>
       </w:tblCellMar>
     </w:tblPr>
@@ -11329,9 +11271,7 @@
       <w:tblStyleRowBandSize w:val="1"/>
       <w:tblStyleColBandSize w:val="1"/>
       <w:tblCellMar>
-        <w:top w:w="0" w:type="dxa"/>
         <w:left w:w="108" w:type="dxa"/>
-        <w:bottom w:w="0" w:type="dxa"/>
         <w:right w:w="108" w:type="dxa"/>
       </w:tblCellMar>
     </w:tblPr>
@@ -11358,9 +11298,7 @@
       <w:tblStyleRowBandSize w:val="1"/>
       <w:tblStyleColBandSize w:val="1"/>
       <w:tblCellMar>
-        <w:top w:w="0" w:type="dxa"/>
         <w:left w:w="108" w:type="dxa"/>
-        <w:bottom w:w="0" w:type="dxa"/>
         <w:right w:w="108" w:type="dxa"/>
       </w:tblCellMar>
     </w:tblPr>
@@ -11374,9 +11312,7 @@
       <w:tblStyleRowBandSize w:val="1"/>
       <w:tblStyleColBandSize w:val="1"/>
       <w:tblCellMar>
-        <w:top w:w="0" w:type="dxa"/>
         <w:left w:w="108" w:type="dxa"/>
-        <w:bottom w:w="0" w:type="dxa"/>
         <w:right w:w="108" w:type="dxa"/>
       </w:tblCellMar>
     </w:tblPr>
@@ -11403,9 +11339,7 @@
       <w:tblStyleRowBandSize w:val="1"/>
       <w:tblStyleColBandSize w:val="1"/>
       <w:tblCellMar>
-        <w:top w:w="0" w:type="dxa"/>
         <w:left w:w="108" w:type="dxa"/>
-        <w:bottom w:w="0" w:type="dxa"/>
         <w:right w:w="108" w:type="dxa"/>
       </w:tblCellMar>
     </w:tblPr>
@@ -11415,12 +11349,6 @@
     <w:tblPr>
       <w:tblStyleRowBandSize w:val="1"/>
       <w:tblStyleColBandSize w:val="1"/>
-      <w:tblCellMar>
-        <w:top w:w="0" w:type="dxa"/>
-        <w:left w:w="0" w:type="dxa"/>
-        <w:bottom w:w="0" w:type="dxa"/>
-        <w:right w:w="0" w:type="dxa"/>
-      </w:tblCellMar>
     </w:tblPr>
   </w:style>
   <w:style w:type="table" w:customStyle="1" w:styleId="a8">
@@ -11432,9 +11360,7 @@
       <w:tblStyleRowBandSize w:val="1"/>
       <w:tblStyleColBandSize w:val="1"/>
       <w:tblCellMar>
-        <w:top w:w="0" w:type="dxa"/>
         <w:left w:w="108" w:type="dxa"/>
-        <w:bottom w:w="0" w:type="dxa"/>
         <w:right w:w="108" w:type="dxa"/>
       </w:tblCellMar>
     </w:tblPr>
@@ -11448,9 +11374,7 @@
       <w:tblStyleRowBandSize w:val="1"/>
       <w:tblStyleColBandSize w:val="1"/>
       <w:tblCellMar>
-        <w:top w:w="0" w:type="dxa"/>
         <w:left w:w="108" w:type="dxa"/>
-        <w:bottom w:w="0" w:type="dxa"/>
         <w:right w:w="108" w:type="dxa"/>
       </w:tblCellMar>
     </w:tblPr>
@@ -11464,9 +11388,7 @@
       <w:tblStyleRowBandSize w:val="1"/>
       <w:tblStyleColBandSize w:val="1"/>
       <w:tblCellMar>
-        <w:top w:w="0" w:type="dxa"/>
         <w:left w:w="108" w:type="dxa"/>
-        <w:bottom w:w="0" w:type="dxa"/>
         <w:right w:w="108" w:type="dxa"/>
       </w:tblCellMar>
     </w:tblPr>
@@ -11494,9 +11416,7 @@
       <w:tblStyleRowBandSize w:val="1"/>
       <w:tblStyleColBandSize w:val="1"/>
       <w:tblCellMar>
-        <w:top w:w="0" w:type="dxa"/>
         <w:left w:w="115" w:type="dxa"/>
-        <w:bottom w:w="0" w:type="dxa"/>
         <w:right w:w="115" w:type="dxa"/>
       </w:tblCellMar>
     </w:tblPr>
@@ -11510,9 +11430,7 @@
       <w:tblStyleRowBandSize w:val="1"/>
       <w:tblStyleColBandSize w:val="1"/>
       <w:tblCellMar>
-        <w:top w:w="0" w:type="dxa"/>
         <w:left w:w="108" w:type="dxa"/>
-        <w:bottom w:w="0" w:type="dxa"/>
         <w:right w:w="108" w:type="dxa"/>
       </w:tblCellMar>
     </w:tblPr>
@@ -11522,12 +11440,6 @@
     <w:tblPr>
       <w:tblStyleRowBandSize w:val="1"/>
       <w:tblStyleColBandSize w:val="1"/>
-      <w:tblCellMar>
-        <w:top w:w="0" w:type="dxa"/>
-        <w:left w:w="0" w:type="dxa"/>
-        <w:bottom w:w="0" w:type="dxa"/>
-        <w:right w:w="0" w:type="dxa"/>
-      </w:tblCellMar>
     </w:tblPr>
   </w:style>
   <w:style w:type="table" w:customStyle="1" w:styleId="ae">
@@ -11535,12 +11447,6 @@
     <w:tblPr>
       <w:tblStyleRowBandSize w:val="1"/>
       <w:tblStyleColBandSize w:val="1"/>
-      <w:tblCellMar>
-        <w:top w:w="0" w:type="dxa"/>
-        <w:left w:w="0" w:type="dxa"/>
-        <w:bottom w:w="0" w:type="dxa"/>
-        <w:right w:w="0" w:type="dxa"/>
-      </w:tblCellMar>
     </w:tblPr>
   </w:style>
   <w:style w:type="table" w:customStyle="1" w:styleId="af">
@@ -11548,12 +11454,6 @@
     <w:tblPr>
       <w:tblStyleRowBandSize w:val="1"/>
       <w:tblStyleColBandSize w:val="1"/>
-      <w:tblCellMar>
-        <w:top w:w="0" w:type="dxa"/>
-        <w:left w:w="0" w:type="dxa"/>
-        <w:bottom w:w="0" w:type="dxa"/>
-        <w:right w:w="0" w:type="dxa"/>
-      </w:tblCellMar>
     </w:tblPr>
   </w:style>
   <w:style w:type="table" w:customStyle="1" w:styleId="af0">
@@ -11561,12 +11461,6 @@
     <w:tblPr>
       <w:tblStyleRowBandSize w:val="1"/>
       <w:tblStyleColBandSize w:val="1"/>
-      <w:tblCellMar>
-        <w:top w:w="0" w:type="dxa"/>
-        <w:left w:w="0" w:type="dxa"/>
-        <w:bottom w:w="0" w:type="dxa"/>
-        <w:right w:w="0" w:type="dxa"/>
-      </w:tblCellMar>
     </w:tblPr>
   </w:style>
   <w:style w:type="table" w:customStyle="1" w:styleId="af1">
@@ -11578,9 +11472,7 @@
       <w:tblStyleRowBandSize w:val="1"/>
       <w:tblStyleColBandSize w:val="1"/>
       <w:tblCellMar>
-        <w:top w:w="0" w:type="dxa"/>
         <w:left w:w="108" w:type="dxa"/>
-        <w:bottom w:w="0" w:type="dxa"/>
         <w:right w:w="108" w:type="dxa"/>
       </w:tblCellMar>
     </w:tblPr>
@@ -11594,9 +11486,7 @@
       <w:tblStyleRowBandSize w:val="1"/>
       <w:tblStyleColBandSize w:val="1"/>
       <w:tblCellMar>
-        <w:top w:w="0" w:type="dxa"/>
         <w:left w:w="108" w:type="dxa"/>
-        <w:bottom w:w="0" w:type="dxa"/>
         <w:right w:w="108" w:type="dxa"/>
       </w:tblCellMar>
     </w:tblPr>

</xml_diff>